<commit_message>
issue #350: Update help for plot and condition zappers to reflect changes to UI in v5.12.0
</commit_message>
<xml_diff>
--- a/Help/DATABASE_Help.docx
+++ b/Help/DATABASE_Help.docx
@@ -1,6 +1,6 @@
 
 <file path=word/document.xml><?xml version="1.0" encoding="utf-8"?>
-<w:document xmlns:wpc="http://schemas.microsoft.com/office/word/2010/wordprocessingCanvas" xmlns:cx="http://schemas.microsoft.com/office/drawing/2014/chartex" xmlns:cx1="http://schemas.microsoft.com/office/drawing/2015/9/8/chartex" xmlns:cx2="http://schemas.microsoft.com/office/drawing/2015/10/21/chartex" xmlns:cx3="http://schemas.microsoft.com/office/drawing/2016/5/9/chartex" xmlns:cx4="http://schemas.microsoft.com/office/drawing/2016/5/10/chartex" xmlns:cx5="http://schemas.microsoft.com/office/drawing/2016/5/11/chartex" xmlns:cx6="http://schemas.microsoft.com/office/drawing/2016/5/12/chartex" xmlns:cx7="http://schemas.microsoft.com/office/drawing/2016/5/13/chartex" xmlns:cx8="http://schemas.microsoft.com/office/drawing/2016/5/14/chartex" xmlns:mc="http://schemas.openxmlformats.org/markup-compatibility/2006" xmlns:aink="http://schemas.microsoft.com/office/drawing/2016/ink" xmlns:am3d="http://schemas.microsoft.com/office/drawing/2017/model3d" xmlns:o="urn:schemas-microsoft-com:office:office" xmlns:r="http://schemas.openxmlformats.org/officeDocument/2006/relationships" xmlns:m="http://schemas.openxmlformats.org/officeDocument/2006/math" xmlns:v="urn:schemas-microsoft-com:vml" xmlns:wp14="http://schemas.microsoft.com/office/word/2010/wordprocessingDrawing" xmlns:wp="http://schemas.openxmlformats.org/drawingml/2006/wordprocessingDrawing" xmlns:w10="urn:schemas-microsoft-com:office:word" xmlns:w="http://schemas.openxmlformats.org/wordprocessingml/2006/main" xmlns:w14="http://schemas.microsoft.com/office/word/2010/wordml" xmlns:w15="http://schemas.microsoft.com/office/word/2012/wordml" xmlns:w16cid="http://schemas.microsoft.com/office/word/2016/wordml/cid" xmlns:w16se="http://schemas.microsoft.com/office/word/2015/wordml/symex" xmlns:wpg="http://schemas.microsoft.com/office/word/2010/wordprocessingGroup" xmlns:wpi="http://schemas.microsoft.com/office/word/2010/wordprocessingInk" xmlns:wne="http://schemas.microsoft.com/office/word/2006/wordml" xmlns:wps="http://schemas.microsoft.com/office/word/2010/wordprocessingShape" mc:Ignorable="w14 w15 w16se w16cid wp14">
+<w:document xmlns:wpc="http://schemas.microsoft.com/office/word/2010/wordprocessingCanvas" xmlns:cx="http://schemas.microsoft.com/office/drawing/2014/chartex" xmlns:cx1="http://schemas.microsoft.com/office/drawing/2015/9/8/chartex" xmlns:cx2="http://schemas.microsoft.com/office/drawing/2015/10/21/chartex" xmlns:cx3="http://schemas.microsoft.com/office/drawing/2016/5/9/chartex" xmlns:cx4="http://schemas.microsoft.com/office/drawing/2016/5/10/chartex" xmlns:cx5="http://schemas.microsoft.com/office/drawing/2016/5/11/chartex" xmlns:cx6="http://schemas.microsoft.com/office/drawing/2016/5/12/chartex" xmlns:cx7="http://schemas.microsoft.com/office/drawing/2016/5/13/chartex" xmlns:cx8="http://schemas.microsoft.com/office/drawing/2016/5/14/chartex" xmlns:mc="http://schemas.openxmlformats.org/markup-compatibility/2006" xmlns:aink="http://schemas.microsoft.com/office/drawing/2016/ink" xmlns:am3d="http://schemas.microsoft.com/office/drawing/2017/model3d" xmlns:o="urn:schemas-microsoft-com:office:office" xmlns:r="http://schemas.openxmlformats.org/officeDocument/2006/relationships" xmlns:m="http://schemas.openxmlformats.org/officeDocument/2006/math" xmlns:v="urn:schemas-microsoft-com:vml" xmlns:wp14="http://schemas.microsoft.com/office/word/2010/wordprocessingDrawing" xmlns:wp="http://schemas.openxmlformats.org/drawingml/2006/wordprocessingDrawing" xmlns:w10="urn:schemas-microsoft-com:office:word" xmlns:w="http://schemas.openxmlformats.org/wordprocessingml/2006/main" xmlns:w14="http://schemas.microsoft.com/office/word/2010/wordml" xmlns:w15="http://schemas.microsoft.com/office/word/2012/wordml" xmlns:w16cex="http://schemas.microsoft.com/office/word/2018/wordml/cex" xmlns:w16cid="http://schemas.microsoft.com/office/word/2016/wordml/cid" xmlns:w16="http://schemas.microsoft.com/office/word/2018/wordml" xmlns:w16sdtdh="http://schemas.microsoft.com/office/word/2020/wordml/sdtdatahash" xmlns:w16se="http://schemas.microsoft.com/office/word/2015/wordml/symex" xmlns:wpg="http://schemas.microsoft.com/office/word/2010/wordprocessingGroup" xmlns:wpi="http://schemas.microsoft.com/office/word/2010/wordprocessingInk" xmlns:wne="http://schemas.microsoft.com/office/word/2006/wordml" xmlns:wps="http://schemas.microsoft.com/office/word/2010/wordprocessingShape" mc:Ignorable="w14 w15 w16se w16cid w16 w16cex w16sdtdh wp14">
   <w:body>
     <w:p>
       <w:pPr>
@@ -1510,43 +1510,12 @@
           <w:u w:val="single"/>
         </w:rPr>
       </w:pPr>
-    </w:p>
-    <w:p>
-      <w:pPr>
-        <w:rPr>
-          <w:b/>
-          <w:u w:val="single"/>
-        </w:rPr>
-      </w:pPr>
-    </w:p>
-    <w:p>
-      <w:pPr>
-        <w:rPr>
-          <w:b/>
-          <w:u w:val="single"/>
-        </w:rPr>
-      </w:pPr>
-    </w:p>
-    <w:p>
-      <w:pPr>
-        <w:rPr>
-          <w:b/>
-          <w:u w:val="single"/>
-        </w:rPr>
-      </w:pPr>
-    </w:p>
-    <w:p>
-      <w:pPr>
-        <w:rPr>
-          <w:b/>
-          <w:u w:val="single"/>
-        </w:rPr>
-      </w:pPr>
-      <w:r>
-        <w:rPr>
-          <w:b/>
-          <w:u w:val="single"/>
-        </w:rPr>
+      <w:r>
+        <w:rPr>
+          <w:b/>
+          <w:u w:val="single"/>
+        </w:rPr>
+        <w:lastRenderedPageBreak/>
         <w:t>Plot Data Input (filter by state and county)</w:t>
       </w:r>
     </w:p>
@@ -1740,51 +1709,27 @@
           <w:u w:val="single"/>
         </w:rPr>
       </w:pPr>
-    </w:p>
-    <w:p>
-      <w:pPr>
-        <w:rPr>
-          <w:b/>
-          <w:u w:val="single"/>
-        </w:rPr>
-      </w:pPr>
-    </w:p>
-    <w:p>
-      <w:pPr>
-        <w:rPr>
-          <w:b/>
-          <w:u w:val="single"/>
-        </w:rPr>
-      </w:pPr>
-    </w:p>
-    <w:p>
-      <w:pPr>
-        <w:rPr>
-          <w:b/>
-          <w:u w:val="single"/>
-        </w:rPr>
-      </w:pPr>
-    </w:p>
-    <w:p>
-      <w:pPr>
-        <w:rPr>
-          <w:b/>
-          <w:u w:val="single"/>
-        </w:rPr>
-      </w:pPr>
-    </w:p>
-    <w:p>
-      <w:pPr>
-        <w:rPr>
-          <w:b/>
-          <w:u w:val="single"/>
-        </w:rPr>
-      </w:pPr>
-      <w:r>
-        <w:rPr>
-          <w:b/>
-          <w:u w:val="single"/>
-        </w:rPr>
+      <w:r>
+        <w:rPr>
+          <w:b/>
+          <w:u w:val="single"/>
+        </w:rPr>
+        <w:br w:type="page"/>
+      </w:r>
+    </w:p>
+    <w:p>
+      <w:pPr>
+        <w:rPr>
+          <w:b/>
+          <w:u w:val="single"/>
+        </w:rPr>
+      </w:pPr>
+      <w:r>
+        <w:rPr>
+          <w:b/>
+          <w:u w:val="single"/>
+        </w:rPr>
+        <w:lastRenderedPageBreak/>
         <w:t>Plot Data Input (filter by plot)</w:t>
       </w:r>
     </w:p>
@@ -1980,43 +1925,27 @@
           <w:u w:val="single"/>
         </w:rPr>
       </w:pPr>
-    </w:p>
-    <w:p>
-      <w:pPr>
-        <w:rPr>
-          <w:b/>
-          <w:u w:val="single"/>
-        </w:rPr>
-      </w:pPr>
-    </w:p>
-    <w:p>
-      <w:pPr>
-        <w:rPr>
-          <w:b/>
-          <w:u w:val="single"/>
-        </w:rPr>
-      </w:pPr>
-    </w:p>
-    <w:p>
-      <w:pPr>
-        <w:rPr>
-          <w:b/>
-          <w:u w:val="single"/>
-        </w:rPr>
-      </w:pPr>
-    </w:p>
-    <w:p>
-      <w:pPr>
-        <w:rPr>
-          <w:b/>
-          <w:u w:val="single"/>
-        </w:rPr>
-      </w:pPr>
-      <w:r>
-        <w:rPr>
-          <w:b/>
-          <w:u w:val="single"/>
-        </w:rPr>
+      <w:r>
+        <w:rPr>
+          <w:b/>
+          <w:u w:val="single"/>
+        </w:rPr>
+        <w:br w:type="page"/>
+      </w:r>
+    </w:p>
+    <w:p>
+      <w:pPr>
+        <w:rPr>
+          <w:b/>
+          <w:u w:val="single"/>
+        </w:rPr>
+      </w:pPr>
+      <w:r>
+        <w:rPr>
+          <w:b/>
+          <w:u w:val="single"/>
+        </w:rPr>
+        <w:lastRenderedPageBreak/>
         <w:t>Delete Conditions</w:t>
       </w:r>
     </w:p>
@@ -2035,12 +1964,10 @@
     </w:p>
     <w:p>
       <w:r>
-        <w:t xml:space="preserve">Three checkboxes offer access to options for creating a log file listing the BioSum project tables searched for data associated with the specified condition records and the number of records deleted from each, compacting each project database after deletions are accomplished, to conserve disk space, and for conducting an inspection and reporting of record counts associated with the targeted conditions, rather than performing the deletions. </w:t>
-      </w:r>
-    </w:p>
-    <w:p>
-      <w:r>
-        <w:t xml:space="preserve">Caution should be exercised when enabling the “compact databases” option because limitations of MS Access result in this step failing intermittently, such that some of the project databases do not successfully compact. </w:t>
+        <w:t>Two</w:t>
+      </w:r>
+      <w:r>
+        <w:t xml:space="preserve"> checkboxes offer access to options for creating a log file listing the BioSum project tables searched for data associated with the specified condition records and the number of records deleted from each, and for conducting an inspection and reporting of record counts associated with the targeted conditions, rather than performing the deletions. </w:t>
       </w:r>
     </w:p>
     <w:p>
@@ -2132,25 +2059,39 @@
           <w:sz w:val="22"/>
           <w:szCs w:val="22"/>
         </w:rPr>
-        <w:t xml:space="preserve">As with the condition zapper, three checkboxes offer access to options for 1) creating a log file listing the BioSum project tables searched for data associated with the records associated with the specified packages and the number of records deleted from each, 2) compacting each project database after deletions are accomplished to conserve disk space, and 3) for conducting an inspection and reporting of record counts associated with the targeted packages, without actually performing the deletions. </w:t>
-      </w:r>
-    </w:p>
-    <w:p>
-      <w:pPr>
-        <w:pStyle w:val="Regulartext"/>
+        <w:t xml:space="preserve">As with the condition zapper, </w:t>
+      </w:r>
+      <w:r>
         <w:rPr>
           <w:rFonts w:asciiTheme="minorHAnsi" w:hAnsiTheme="minorHAnsi" w:cstheme="minorHAnsi"/>
           <w:sz w:val="22"/>
           <w:szCs w:val="22"/>
         </w:rPr>
-      </w:pPr>
+        <w:t>two</w:t>
+      </w:r>
       <w:r>
         <w:rPr>
           <w:rFonts w:asciiTheme="minorHAnsi" w:hAnsiTheme="minorHAnsi" w:cstheme="minorHAnsi"/>
           <w:sz w:val="22"/>
           <w:szCs w:val="22"/>
         </w:rPr>
-        <w:t xml:space="preserve">Caution should be exercised when enabling the “compact databases” option because limitations of MS Access result in this step failing intermittently, such that some of the project databases do not successfully compact. </w:t>
+        <w:t xml:space="preserve"> checkboxes offer access to options for 1) creating a log file listing the BioSum project tables searched for data associated with the records associated with the specified packages and the number of records deleted from each and </w:t>
+      </w:r>
+      <w:r>
+        <w:rPr>
+          <w:rFonts w:asciiTheme="minorHAnsi" w:hAnsiTheme="minorHAnsi" w:cstheme="minorHAnsi"/>
+          <w:sz w:val="22"/>
+          <w:szCs w:val="22"/>
+        </w:rPr>
+        <w:t>2</w:t>
+      </w:r>
+      <w:r>
+        <w:rPr>
+          <w:rFonts w:asciiTheme="minorHAnsi" w:hAnsiTheme="minorHAnsi" w:cstheme="minorHAnsi"/>
+          <w:sz w:val="22"/>
+          <w:szCs w:val="22"/>
+        </w:rPr>
+        <w:t xml:space="preserve">) for conducting an inspection and reporting of record counts associated with the targeted packages, without actually performing the deletions. </w:t>
       </w:r>
     </w:p>
     <w:p>
@@ -3136,12 +3077,7 @@
       </w:r>
       <w:proofErr w:type="spellEnd"/>
       <w:r>
-        <w:t xml:space="preserve"> folders.</w:t>
-      </w:r>
-      <w:bookmarkStart w:id="1" w:name="_GoBack"/>
-      <w:bookmarkEnd w:id="1"/>
-      <w:r>
-        <w:t xml:space="preserve"> Future plans for BioSum include migrating all data storage to SQLite so the list of potentially viewable SQLite databases will continue to grow.</w:t>
+        <w:t xml:space="preserve"> folders. Future plans for BioSum include migrating all data storage to SQLite so the list of potentially viewable SQLite databases will continue to grow.</w:t>
       </w:r>
     </w:p>
     <w:p>
@@ -3347,7 +3283,7 @@
 </file>
 
 <file path=word/numbering.xml><?xml version="1.0" encoding="utf-8"?>
-<w:numbering xmlns:wpc="http://schemas.microsoft.com/office/word/2010/wordprocessingCanvas" xmlns:cx="http://schemas.microsoft.com/office/drawing/2014/chartex" xmlns:cx1="http://schemas.microsoft.com/office/drawing/2015/9/8/chartex" xmlns:cx2="http://schemas.microsoft.com/office/drawing/2015/10/21/chartex" xmlns:cx3="http://schemas.microsoft.com/office/drawing/2016/5/9/chartex" xmlns:cx4="http://schemas.microsoft.com/office/drawing/2016/5/10/chartex" xmlns:cx5="http://schemas.microsoft.com/office/drawing/2016/5/11/chartex" xmlns:cx6="http://schemas.microsoft.com/office/drawing/2016/5/12/chartex" xmlns:cx7="http://schemas.microsoft.com/office/drawing/2016/5/13/chartex" xmlns:cx8="http://schemas.microsoft.com/office/drawing/2016/5/14/chartex" xmlns:mc="http://schemas.openxmlformats.org/markup-compatibility/2006" xmlns:aink="http://schemas.microsoft.com/office/drawing/2016/ink" xmlns:am3d="http://schemas.microsoft.com/office/drawing/2017/model3d" xmlns:o="urn:schemas-microsoft-com:office:office" xmlns:r="http://schemas.openxmlformats.org/officeDocument/2006/relationships" xmlns:m="http://schemas.openxmlformats.org/officeDocument/2006/math" xmlns:v="urn:schemas-microsoft-com:vml" xmlns:wp14="http://schemas.microsoft.com/office/word/2010/wordprocessingDrawing" xmlns:wp="http://schemas.openxmlformats.org/drawingml/2006/wordprocessingDrawing" xmlns:w10="urn:schemas-microsoft-com:office:word" xmlns:w="http://schemas.openxmlformats.org/wordprocessingml/2006/main" xmlns:w14="http://schemas.microsoft.com/office/word/2010/wordml" xmlns:w15="http://schemas.microsoft.com/office/word/2012/wordml" xmlns:w16cid="http://schemas.microsoft.com/office/word/2016/wordml/cid" xmlns:w16se="http://schemas.microsoft.com/office/word/2015/wordml/symex" xmlns:wpg="http://schemas.microsoft.com/office/word/2010/wordprocessingGroup" xmlns:wpi="http://schemas.microsoft.com/office/word/2010/wordprocessingInk" xmlns:wne="http://schemas.microsoft.com/office/word/2006/wordml" xmlns:wps="http://schemas.microsoft.com/office/word/2010/wordprocessingShape" mc:Ignorable="w14 w15 w16se w16cid wp14">
+<w:numbering xmlns:wpc="http://schemas.microsoft.com/office/word/2010/wordprocessingCanvas" xmlns:cx="http://schemas.microsoft.com/office/drawing/2014/chartex" xmlns:cx1="http://schemas.microsoft.com/office/drawing/2015/9/8/chartex" xmlns:cx2="http://schemas.microsoft.com/office/drawing/2015/10/21/chartex" xmlns:cx3="http://schemas.microsoft.com/office/drawing/2016/5/9/chartex" xmlns:cx4="http://schemas.microsoft.com/office/drawing/2016/5/10/chartex" xmlns:cx5="http://schemas.microsoft.com/office/drawing/2016/5/11/chartex" xmlns:cx6="http://schemas.microsoft.com/office/drawing/2016/5/12/chartex" xmlns:cx7="http://schemas.microsoft.com/office/drawing/2016/5/13/chartex" xmlns:cx8="http://schemas.microsoft.com/office/drawing/2016/5/14/chartex" xmlns:mc="http://schemas.openxmlformats.org/markup-compatibility/2006" xmlns:aink="http://schemas.microsoft.com/office/drawing/2016/ink" xmlns:am3d="http://schemas.microsoft.com/office/drawing/2017/model3d" xmlns:o="urn:schemas-microsoft-com:office:office" xmlns:r="http://schemas.openxmlformats.org/officeDocument/2006/relationships" xmlns:m="http://schemas.openxmlformats.org/officeDocument/2006/math" xmlns:v="urn:schemas-microsoft-com:vml" xmlns:wp14="http://schemas.microsoft.com/office/word/2010/wordprocessingDrawing" xmlns:wp="http://schemas.openxmlformats.org/drawingml/2006/wordprocessingDrawing" xmlns:w10="urn:schemas-microsoft-com:office:word" xmlns:w="http://schemas.openxmlformats.org/wordprocessingml/2006/main" xmlns:w14="http://schemas.microsoft.com/office/word/2010/wordml" xmlns:w15="http://schemas.microsoft.com/office/word/2012/wordml" xmlns:w16cex="http://schemas.microsoft.com/office/word/2018/wordml/cex" xmlns:w16cid="http://schemas.microsoft.com/office/word/2016/wordml/cid" xmlns:w16="http://schemas.microsoft.com/office/word/2018/wordml" xmlns:w16sdtdh="http://schemas.microsoft.com/office/word/2020/wordml/sdtdatahash" xmlns:w16se="http://schemas.microsoft.com/office/word/2015/wordml/symex" xmlns:wpg="http://schemas.microsoft.com/office/word/2010/wordprocessingGroup" xmlns:wpi="http://schemas.microsoft.com/office/word/2010/wordprocessingInk" xmlns:wne="http://schemas.microsoft.com/office/word/2006/wordml" xmlns:wps="http://schemas.microsoft.com/office/word/2010/wordprocessingShape" mc:Ignorable="w14 w15 w16se w16cid w16 w16cex w16sdtdh wp14">
   <w:abstractNum w:abstractNumId="0" w15:restartNumberingAfterBreak="0">
     <w:nsid w:val="2D3927F8"/>
     <w:multiLevelType w:val="hybridMultilevel"/>
@@ -3629,7 +3565,7 @@
 </file>
 
 <file path=word/styles.xml><?xml version="1.0" encoding="utf-8"?>
-<w:styles xmlns:mc="http://schemas.openxmlformats.org/markup-compatibility/2006" xmlns:r="http://schemas.openxmlformats.org/officeDocument/2006/relationships" xmlns:w="http://schemas.openxmlformats.org/wordprocessingml/2006/main" xmlns:w14="http://schemas.microsoft.com/office/word/2010/wordml" xmlns:w15="http://schemas.microsoft.com/office/word/2012/wordml" xmlns:w16cid="http://schemas.microsoft.com/office/word/2016/wordml/cid" xmlns:w16se="http://schemas.microsoft.com/office/word/2015/wordml/symex" mc:Ignorable="w14 w15 w16se w16cid">
+<w:styles xmlns:mc="http://schemas.openxmlformats.org/markup-compatibility/2006" xmlns:r="http://schemas.openxmlformats.org/officeDocument/2006/relationships" xmlns:w="http://schemas.openxmlformats.org/wordprocessingml/2006/main" xmlns:w14="http://schemas.microsoft.com/office/word/2010/wordml" xmlns:w15="http://schemas.microsoft.com/office/word/2012/wordml" xmlns:w16cex="http://schemas.microsoft.com/office/word/2018/wordml/cex" xmlns:w16cid="http://schemas.microsoft.com/office/word/2016/wordml/cid" xmlns:w16="http://schemas.microsoft.com/office/word/2018/wordml" xmlns:w16sdtdh="http://schemas.microsoft.com/office/word/2020/wordml/sdtdatahash" xmlns:w16se="http://schemas.microsoft.com/office/word/2015/wordml/symex" mc:Ignorable="w14 w15 w16se w16cid w16 w16cex w16sdtdh">
   <w:docDefaults>
     <w:rPrDefault>
       <w:rPr>
@@ -3645,7 +3581,7 @@
       </w:pPr>
     </w:pPrDefault>
   </w:docDefaults>
-  <w:latentStyles w:defLockedState="0" w:defUIPriority="99" w:defSemiHidden="0" w:defUnhideWhenUsed="0" w:defQFormat="0" w:count="375">
+  <w:latentStyles w:defLockedState="0" w:defUIPriority="99" w:defSemiHidden="0" w:defUnhideWhenUsed="0" w:defQFormat="0" w:count="376">
     <w:lsdException w:name="Normal" w:uiPriority="0" w:qFormat="1"/>
     <w:lsdException w:name="heading 1" w:uiPriority="9" w:qFormat="1"/>
     <w:lsdException w:name="heading 2" w:semiHidden="1" w:uiPriority="9" w:unhideWhenUsed="1" w:qFormat="1"/>
@@ -4021,6 +3957,7 @@
     <w:lsdException w:name="Smart Hyperlink" w:semiHidden="1" w:unhideWhenUsed="1"/>
     <w:lsdException w:name="Hashtag" w:semiHidden="1" w:unhideWhenUsed="1"/>
     <w:lsdException w:name="Unresolved Mention" w:semiHidden="1" w:unhideWhenUsed="1"/>
+    <w:lsdException w:name="Smart Link" w:semiHidden="1" w:unhideWhenUsed="1"/>
   </w:latentStyles>
   <w:style w:type="paragraph" w:default="1" w:styleId="Normal">
     <w:name w:val="Normal"/>

</xml_diff>